<commit_message>
Update technical evidence report for the final report-generation notebook
Section 5 now describes notebooks/Team29_Report_Generation_Final.ipynb: CheXpert-only XRV features with an IU-trained tag classifier and forced findings, replacing the OpenI-trained tagger. Regenerated the Markdown and Word report from build_submission_documents.py.
</commit_message>
<xml_diff>
--- a/docs/technical_evidence_report.docx
+++ b/docs/technical_evidence_report.docx
@@ -4527,7 +4527,7 @@
     </w:p>
     <w:p>
       <w:r>
-        <w:t xml:space="preserve">The team's report generator uses FLAN-T5-small with ResNet18 visual tokens and XRV pathology tags. Its XRV </w:t>
+        <w:t xml:space="preserve">The team's first report generator used FLAN-T5-small with ResNet18 visual tokens and XRV pathology tags. Its XRV </w:t>
       </w:r>
       <w:r>
         <w:rPr>
@@ -4564,7 +4564,7 @@
         <w:t>not</w:t>
       </w:r>
       <w:r>
-        <w:t xml:space="preserve"> prove that a particular local test image or patient was seen. Independent evaluation of this component remains unestablished; it is not accurate to claim proven image-level test leakage or quantify its effect from the available files.</w:t>
+        <w:t xml:space="preserve"> prove that a particular local test image or patient was seen; it is not accurate to claim proven image-level test leakage or quantify its effect from the available files.</w:t>
       </w:r>
     </w:p>
     <w:p>
@@ -4592,6 +4592,41 @@
       </w:hyperlink>
       <w:r>
         <w:t>. The deployed classifier uses ImageNet weights and does not use this XRV component.</w:t>
+      </w:r>
+    </w:p>
+    <w:p>
+      <w:r>
+        <w:t xml:space="preserve">The final notebook, </w:t>
+      </w:r>
+      <w:r>
+        <w:rPr>
+          <w:rFonts w:ascii="Consolas" w:hAnsi="Consolas"/>
+          <w:sz w:val="18"/>
+        </w:rPr>
+        <w:t>notebooks/Team29_Report_Generation_Final.ipynb</w:t>
+      </w:r>
+      <w:r>
+        <w:t xml:space="preserve">, removes that tagger. Tags come from a linear classifier trained on IU training studies only, on 1024-D features from the CheXpert-only </w:t>
+      </w:r>
+      <w:r>
+        <w:rPr>
+          <w:rFonts w:ascii="Consolas" w:hAnsi="Consolas"/>
+          <w:sz w:val="18"/>
+        </w:rPr>
+        <w:t>densenet121-res224-chex</w:t>
+      </w:r>
+      <w:r>
+        <w:t xml:space="preserve"> weights; training tags are out-of-fold. After generation, a fixed finding sentence is added when the classifier is confident, using thresholds that reach 60% out-of-fold training precision. </w:t>
+      </w:r>
+      <w:r>
+        <w:rPr>
+          <w:rFonts w:ascii="Consolas" w:hAnsi="Consolas"/>
+          <w:sz w:val="18"/>
+        </w:rPr>
+        <w:t>src/pulmonary/learned_reports.py</w:t>
+      </w:r>
+      <w:r>
+        <w:t xml:space="preserve"> loads this export and rejects exports built with the OpenI-trained weights.</w:t>
       </w:r>
     </w:p>
     <w:tbl>
@@ -4731,7 +4766,7 @@
               <w:rPr>
                 <w:sz w:val="20"/>
               </w:rPr>
-              <w:t>Team learned FLAN-T5 draft</w:t>
+              <w:t>Team learned FLAN-T5 draft (final notebook)</w:t>
             </w:r>
           </w:p>
         </w:tc>
@@ -4747,7 +4782,7 @@
               <w:rPr>
                 <w:sz w:val="20"/>
               </w:rPr>
-              <w:t>Export reload reproduced its saved example; fluent text with omission risks and unresolved upstream overlap</w:t>
+              <w:t>Notebook reload verified prompts, classifier probabilities and forced findings; fluent text with omission risks</w:t>
             </w:r>
           </w:p>
         </w:tc>
@@ -4772,7 +4807,7 @@
     <w:p/>
     <w:p>
       <w:r>
-        <w:t>The supplied learned-generator test checks found cardiomegaly in 7/23 reference cases, atelectasis in 1/45, opacity in 9/70 and granuloma in 3/49. These are limited lexical checks, not clinician-adjudicated scores, but demonstrate why fluency is insufficient. Its supplied BLEU 17.30 / ROUGE-L 0.377 / METEOR 0.326 are language similarity metrics, not diagnostic accuracy. Image swaps moved both visual tokens and XRV tags, so they do not isolate the visual-token branch. Two supplied V2 folders represent different runs and were not merged into one result. The full notebook analysis and reporting decision are consolidated in this report.</w:t>
+        <w:t>The notebook's supplied test results (362 studies) for the final model are BLEU 18.5 / ROUGE-L 0.391 / METEOR 0.339. Lexical finding checks found cardiomegaly in 7/23 reference cases (14 mentions), atelectasis in 2/45 (7) and opacity in 15/70 (53); granuloma was dropped because its classifier was too weak. The superseded OpenI-tagger run had BLEU 17.30 / ROUGE-L 0.377 / METEOR 0.326 with cardiomegaly 7/23, atelectasis 1/45 and opacity 9/70. These are limited lexical checks and language-similarity metrics, not clinician-adjudicated diagnostic accuracy, and they were not re-run in this repository. The test split was evaluated four times during notebook development, so these are not untouched-holdout results. Splits are by study, not patient. Image swaps move both visual tokens and tags, so they do not isolate the visual-token branch. The full notebook analysis and reporting decision are consolidated in this report.</w:t>
       </w:r>
     </w:p>
     <w:p>

</xml_diff>